<commit_message>
admin otp login for 2fa
</commit_message>
<xml_diff>
--- a/🎓 Student Grievance Management System.docx
+++ b/🎓 Student Grievance Management System.docx
@@ -775,29 +775,15 @@
           <w:sz w:val="24"/>
           <w:szCs w:val="24"/>
         </w:rPr>
-        <w:t>Secure login with 2FA</w:t>
-      </w:r>
-    </w:p>
-    <w:p>
-      <w:pPr>
-        <w:numPr>
-          <w:ilvl w:val="1"/>
-          <w:numId w:val="2"/>
-        </w:numPr>
-        <w:spacing w:before="100" w:beforeAutospacing="1" w:after="100" w:afterAutospacing="1" w:line="240" w:lineRule="auto"/>
-        <w:rPr>
-          <w:rFonts w:ascii="Times New Roman" w:eastAsia="Times New Roman" w:hAnsi="Times New Roman" w:cs="Times New Roman"/>
-          <w:sz w:val="24"/>
-          <w:szCs w:val="24"/>
-        </w:rPr>
-      </w:pPr>
-      <w:r>
-        <w:rPr>
-          <w:rFonts w:ascii="Times New Roman" w:eastAsia="Times New Roman" w:hAnsi="Times New Roman" w:cs="Times New Roman"/>
-          <w:sz w:val="24"/>
-          <w:szCs w:val="24"/>
-        </w:rPr>
-        <w:t>Password recovery/reset</w:t>
+        <w:t>Login with password and then verify with OTP</w:t>
+      </w:r>
+      <w:r>
+        <w:rPr>
+          <w:rFonts w:ascii="Times New Roman" w:eastAsia="Times New Roman" w:hAnsi="Times New Roman" w:cs="Times New Roman"/>
+          <w:sz w:val="24"/>
+          <w:szCs w:val="24"/>
+        </w:rPr>
+        <w:t xml:space="preserve"> (only for admin)</w:t>
       </w:r>
     </w:p>
     <w:p>
@@ -855,15 +841,47 @@
           <w:sz w:val="24"/>
           <w:szCs w:val="24"/>
         </w:rPr>
-        <w:t>Super Admin:</w:t>
-      </w:r>
-      <w:r>
-        <w:rPr>
-          <w:rFonts w:ascii="Times New Roman" w:eastAsia="Times New Roman" w:hAnsi="Times New Roman" w:cs="Times New Roman"/>
-          <w:sz w:val="24"/>
-          <w:szCs w:val="24"/>
-        </w:rPr>
-        <w:t xml:space="preserve"> Full access, manages admins and system settings</w:t>
+        <w:t>Admin:</w:t>
+      </w:r>
+      <w:r>
+        <w:rPr>
+          <w:rFonts w:ascii="Times New Roman" w:eastAsia="Times New Roman" w:hAnsi="Times New Roman" w:cs="Times New Roman"/>
+          <w:sz w:val="24"/>
+          <w:szCs w:val="24"/>
+        </w:rPr>
+        <w:t xml:space="preserve"> Full access, manages </w:t>
+      </w:r>
+      <w:r>
+        <w:rPr>
+          <w:rFonts w:ascii="Times New Roman" w:eastAsia="Times New Roman" w:hAnsi="Times New Roman" w:cs="Times New Roman"/>
+          <w:sz w:val="24"/>
+          <w:szCs w:val="24"/>
+        </w:rPr>
+        <w:t>department</w:t>
+      </w:r>
+      <w:r>
+        <w:rPr>
+          <w:rFonts w:ascii="Times New Roman" w:eastAsia="Times New Roman" w:hAnsi="Times New Roman" w:cs="Times New Roman"/>
+          <w:sz w:val="24"/>
+          <w:szCs w:val="24"/>
+        </w:rPr>
+        <w:t xml:space="preserve"> admin</w:t>
+      </w:r>
+      <w:r>
+        <w:rPr>
+          <w:rFonts w:ascii="Times New Roman" w:eastAsia="Times New Roman" w:hAnsi="Times New Roman" w:cs="Times New Roman"/>
+          <w:sz w:val="24"/>
+          <w:szCs w:val="24"/>
+        </w:rPr>
+        <w:t>, manage student, manage grievance</w:t>
+      </w:r>
+      <w:r>
+        <w:rPr>
+          <w:rFonts w:ascii="Times New Roman" w:eastAsia="Times New Roman" w:hAnsi="Times New Roman" w:cs="Times New Roman"/>
+          <w:sz w:val="24"/>
+          <w:szCs w:val="24"/>
+        </w:rPr>
+        <w:t xml:space="preserve"> and system settings</w:t>
       </w:r>
     </w:p>
     <w:p>
@@ -914,38 +932,6 @@
       <w:r>
         <w:rPr>
           <w:rFonts w:ascii="Times New Roman" w:eastAsia="Times New Roman" w:hAnsi="Times New Roman" w:cs="Times New Roman"/>
-          <w:b/>
-          <w:bCs/>
-          <w:sz w:val="24"/>
-          <w:szCs w:val="24"/>
-        </w:rPr>
-        <w:t>Grievance Officer:</w:t>
-      </w:r>
-      <w:r>
-        <w:rPr>
-          <w:rFonts w:ascii="Times New Roman" w:eastAsia="Times New Roman" w:hAnsi="Times New Roman" w:cs="Times New Roman"/>
-          <w:sz w:val="24"/>
-          <w:szCs w:val="24"/>
-        </w:rPr>
-        <w:t xml:space="preserve"> Assigned to resolve/manage specific grievances</w:t>
-      </w:r>
-    </w:p>
-    <w:p>
-      <w:pPr>
-        <w:numPr>
-          <w:ilvl w:val="1"/>
-          <w:numId w:val="2"/>
-        </w:numPr>
-        <w:spacing w:before="100" w:beforeAutospacing="1" w:after="100" w:afterAutospacing="1" w:line="240" w:lineRule="auto"/>
-        <w:rPr>
-          <w:rFonts w:ascii="Times New Roman" w:eastAsia="Times New Roman" w:hAnsi="Times New Roman" w:cs="Times New Roman"/>
-          <w:sz w:val="24"/>
-          <w:szCs w:val="24"/>
-        </w:rPr>
-      </w:pPr>
-      <w:r>
-        <w:rPr>
-          <w:rFonts w:ascii="Times New Roman" w:eastAsia="Times New Roman" w:hAnsi="Times New Roman" w:cs="Times New Roman"/>
           <w:sz w:val="24"/>
           <w:szCs w:val="24"/>
         </w:rPr>
@@ -973,29 +959,29 @@
           <w:sz w:val="24"/>
           <w:szCs w:val="24"/>
         </w:rPr>
+        <w:t>Dashboard Overview</w:t>
+      </w:r>
+    </w:p>
+    <w:p>
+      <w:pPr>
+        <w:numPr>
+          <w:ilvl w:val="1"/>
+          <w:numId w:val="2"/>
+        </w:numPr>
+        <w:spacing w:before="100" w:beforeAutospacing="1" w:after="100" w:afterAutospacing="1" w:line="240" w:lineRule="auto"/>
+        <w:rPr>
+          <w:rFonts w:ascii="Times New Roman" w:eastAsia="Times New Roman" w:hAnsi="Times New Roman" w:cs="Times New Roman"/>
+          <w:sz w:val="24"/>
+          <w:szCs w:val="24"/>
+        </w:rPr>
+      </w:pPr>
+      <w:r>
+        <w:rPr>
+          <w:rFonts w:ascii="Times New Roman" w:eastAsia="Times New Roman" w:hAnsi="Times New Roman" w:cs="Times New Roman"/>
+          <w:sz w:val="24"/>
+          <w:szCs w:val="24"/>
+        </w:rPr>
         <w:lastRenderedPageBreak/>
-        <w:t>Dashboard Overview</w:t>
-      </w:r>
-    </w:p>
-    <w:p>
-      <w:pPr>
-        <w:numPr>
-          <w:ilvl w:val="1"/>
-          <w:numId w:val="2"/>
-        </w:numPr>
-        <w:spacing w:before="100" w:beforeAutospacing="1" w:after="100" w:afterAutospacing="1" w:line="240" w:lineRule="auto"/>
-        <w:rPr>
-          <w:rFonts w:ascii="Times New Roman" w:eastAsia="Times New Roman" w:hAnsi="Times New Roman" w:cs="Times New Roman"/>
-          <w:sz w:val="24"/>
-          <w:szCs w:val="24"/>
-        </w:rPr>
-      </w:pPr>
-      <w:r>
-        <w:rPr>
-          <w:rFonts w:ascii="Times New Roman" w:eastAsia="Times New Roman" w:hAnsi="Times New Roman" w:cs="Times New Roman"/>
-          <w:sz w:val="24"/>
-          <w:szCs w:val="24"/>
-        </w:rPr>
         <w:t>Total, pending, resolved grievances</w:t>
       </w:r>
     </w:p>
@@ -1042,51 +1028,83 @@
           <w:sz w:val="24"/>
           <w:szCs w:val="24"/>
         </w:rPr>
-        <w:t>View all grievances (filter by category, department, date, student, etc.)</w:t>
-      </w:r>
-    </w:p>
-    <w:p>
-      <w:pPr>
-        <w:numPr>
-          <w:ilvl w:val="1"/>
-          <w:numId w:val="2"/>
-        </w:numPr>
-        <w:spacing w:before="100" w:beforeAutospacing="1" w:after="100" w:afterAutospacing="1" w:line="240" w:lineRule="auto"/>
-        <w:rPr>
-          <w:rFonts w:ascii="Times New Roman" w:eastAsia="Times New Roman" w:hAnsi="Times New Roman" w:cs="Times New Roman"/>
-          <w:sz w:val="24"/>
-          <w:szCs w:val="24"/>
-        </w:rPr>
-      </w:pPr>
-      <w:r>
-        <w:rPr>
-          <w:rFonts w:ascii="Times New Roman" w:eastAsia="Times New Roman" w:hAnsi="Times New Roman" w:cs="Times New Roman"/>
-          <w:sz w:val="24"/>
-          <w:szCs w:val="24"/>
-        </w:rPr>
-        <w:t>Change status (Pending → Under Review → Resolved/Rejected)</w:t>
-      </w:r>
-    </w:p>
-    <w:p>
-      <w:pPr>
-        <w:numPr>
-          <w:ilvl w:val="1"/>
-          <w:numId w:val="2"/>
-        </w:numPr>
-        <w:spacing w:before="100" w:beforeAutospacing="1" w:after="100" w:afterAutospacing="1" w:line="240" w:lineRule="auto"/>
-        <w:rPr>
-          <w:rFonts w:ascii="Times New Roman" w:eastAsia="Times New Roman" w:hAnsi="Times New Roman" w:cs="Times New Roman"/>
-          <w:sz w:val="24"/>
-          <w:szCs w:val="24"/>
-        </w:rPr>
-      </w:pPr>
-      <w:r>
-        <w:rPr>
-          <w:rFonts w:ascii="Times New Roman" w:eastAsia="Times New Roman" w:hAnsi="Times New Roman" w:cs="Times New Roman"/>
-          <w:sz w:val="24"/>
-          <w:szCs w:val="24"/>
-        </w:rPr>
-        <w:t>Add internal comments or reply to students</w:t>
+        <w:t>View all grievances</w:t>
+      </w:r>
+      <w:r>
+        <w:rPr>
+          <w:rFonts w:ascii="Times New Roman" w:eastAsia="Times New Roman" w:hAnsi="Times New Roman" w:cs="Times New Roman"/>
+          <w:sz w:val="24"/>
+          <w:szCs w:val="24"/>
+        </w:rPr>
+        <w:t xml:space="preserve"> sent by students</w:t>
+      </w:r>
+      <w:r>
+        <w:rPr>
+          <w:rFonts w:ascii="Times New Roman" w:eastAsia="Times New Roman" w:hAnsi="Times New Roman" w:cs="Times New Roman"/>
+          <w:sz w:val="24"/>
+          <w:szCs w:val="24"/>
+        </w:rPr>
+        <w:t xml:space="preserve"> (filter by category, department, date, student, etc.)</w:t>
+      </w:r>
+    </w:p>
+    <w:p>
+      <w:pPr>
+        <w:numPr>
+          <w:ilvl w:val="1"/>
+          <w:numId w:val="2"/>
+        </w:numPr>
+        <w:spacing w:before="100" w:beforeAutospacing="1" w:after="100" w:afterAutospacing="1" w:line="240" w:lineRule="auto"/>
+        <w:rPr>
+          <w:rFonts w:ascii="Times New Roman" w:eastAsia="Times New Roman" w:hAnsi="Times New Roman" w:cs="Times New Roman"/>
+          <w:sz w:val="24"/>
+          <w:szCs w:val="24"/>
+        </w:rPr>
+      </w:pPr>
+      <w:r>
+        <w:rPr>
+          <w:rFonts w:ascii="Times New Roman" w:eastAsia="Times New Roman" w:hAnsi="Times New Roman" w:cs="Times New Roman"/>
+          <w:sz w:val="24"/>
+          <w:szCs w:val="24"/>
+        </w:rPr>
+        <w:t>Change status (Pending → Resolved/Rejected)</w:t>
+      </w:r>
+    </w:p>
+    <w:p>
+      <w:pPr>
+        <w:numPr>
+          <w:ilvl w:val="1"/>
+          <w:numId w:val="2"/>
+        </w:numPr>
+        <w:spacing w:before="100" w:beforeAutospacing="1" w:after="100" w:afterAutospacing="1" w:line="240" w:lineRule="auto"/>
+        <w:rPr>
+          <w:rFonts w:ascii="Times New Roman" w:eastAsia="Times New Roman" w:hAnsi="Times New Roman" w:cs="Times New Roman"/>
+          <w:sz w:val="24"/>
+          <w:szCs w:val="24"/>
+        </w:rPr>
+      </w:pPr>
+      <w:r>
+        <w:rPr>
+          <w:rFonts w:ascii="Times New Roman" w:eastAsia="Times New Roman" w:hAnsi="Times New Roman" w:cs="Times New Roman"/>
+          <w:sz w:val="24"/>
+          <w:szCs w:val="24"/>
+        </w:rPr>
+        <w:t>Admin Responses &amp; Comments</w:t>
+      </w:r>
+      <w:r>
+        <w:rPr>
+          <w:rFonts w:ascii="Times New Roman" w:eastAsia="Times New Roman" w:hAnsi="Times New Roman" w:cs="Times New Roman"/>
+          <w:sz w:val="24"/>
+          <w:szCs w:val="24"/>
+        </w:rPr>
+        <w:t xml:space="preserve"> f</w:t>
+      </w:r>
+      <w:r>
+        <w:rPr>
+          <w:rFonts w:ascii="Times New Roman" w:eastAsia="Times New Roman" w:hAnsi="Times New Roman" w:cs="Times New Roman"/>
+          <w:sz w:val="24"/>
+          <w:szCs w:val="24"/>
+        </w:rPr>
+        <w:t>or reply to students</w:t>
       </w:r>
     </w:p>
     <w:p>

</xml_diff>